<commit_message>
环境变量CLASSPATH没设JSTAF.jar会导致报错Native Library /usr/local/staf/lib/libJSTAF.so already loaded in another classloader
git-svn-id: http://192.168.20.11/sequoiadb/trunk@27947 6121f079-4a18-41d3-8c30-8870a322f2c2
</commit_message>
<xml_diff>
--- a/misc/ci/internal_doc/add_new_machine.docx
+++ b/misc/ci/internal_doc/add_new_machine.docx
@@ -612,6 +612,9 @@
       <w:r>
         <w:t>export CLASSPATH=.:$JAVA_HOME/lib/dt.jar:$JAVA_HOME/lib/tools.jar</w:t>
       </w:r>
+      <w:r>
+        <w:t>:$CLASSPATH</w:t>
+      </w:r>
     </w:p>
     <w:p>
       <w:r>
@@ -642,11 +645,6 @@
       </w:r>
     </w:p>
     <w:p>
-      <w:pPr>
-        <w:rPr>
-          <w:rFonts w:hint="eastAsia"/>
-        </w:rPr>
-      </w:pPr>
       <w:r>
         <w:rPr>
           <w:rFonts w:hint="eastAsia"/>
@@ -711,9 +709,6 @@
     <w:p>
       <w:pPr>
         <w:pStyle w:val="Heading3"/>
-        <w:rPr>
-          <w:rFonts w:hint="eastAsia"/>
-        </w:rPr>
       </w:pPr>
       <w:r>
         <w:rPr>
@@ -762,11 +757,6 @@
     </w:p>
     <w:p/>
     <w:p>
-      <w:pPr>
-        <w:rPr>
-          <w:rFonts w:hint="eastAsia"/>
-        </w:rPr>
-      </w:pPr>
       <w:r>
         <w:rPr>
           <w:rFonts w:hint="eastAsia"/>
@@ -835,11 +825,6 @@
       </w:r>
     </w:p>
     <w:p>
-      <w:pPr>
-        <w:rPr>
-          <w:rFonts w:hint="eastAsia"/>
-        </w:rPr>
-      </w:pPr>
       <w:r>
         <w:rPr>
           <w:rFonts w:hint="eastAsia"/>
@@ -908,11 +893,6 @@
       </w:r>
     </w:p>
     <w:p>
-      <w:pPr>
-        <w:rPr>
-          <w:rFonts w:hint="eastAsia"/>
-        </w:rPr>
-      </w:pPr>
       <w:r>
         <w:rPr>
           <w:rFonts w:hint="eastAsia"/>
@@ -1394,7 +1374,13 @@
     </w:p>
     <w:p>
       <w:r>
-        <w:t>CLASSPATH="/usr/local/staf/lib/STAFAnt.jar:${CLASSPATH}"</w:t>
+        <w:t>CLASSPATH="/usr/local/staf/lib/STAFAnt.jar</w:t>
+      </w:r>
+      <w:r>
+        <w:t>:/usr/local/staf/samples/demo/STAFDemo.jar:/usr/local/staf/lib/JSTAF.jar</w:t>
+      </w:r>
+      <w:r>
+        <w:t>:${CLASSPATH}"</w:t>
       </w:r>
     </w:p>
     <w:p/>
@@ -1559,6 +1545,7 @@
         <w:rPr>
           <w:rFonts w:hint="eastAsia"/>
         </w:rPr>
+        <w:lastRenderedPageBreak/>
         <w:t>在配置文件</w:t>
       </w:r>
       <w:r>
@@ -1576,7 +1563,6 @@
     </w:p>
     <w:p>
       <w:r>
-        <w:lastRenderedPageBreak/>
         <w:t>#&lt;domain&gt;      &lt;type&gt;    &lt;item&gt;     &lt;value&gt;</w:t>
       </w:r>
     </w:p>

</xml_diff>